<commit_message>
Day 9-16 documents: remove duplicated choose-count, tidy plan row wording
Co-Authored-By: Claude Sonnet 5.5 <noreply@anthropic.com>
</commit_message>
<xml_diff>
--- a/materi-task-docx/Day10-Task-Habmann-Digital-Learning-TrackLearn-UX-Analysis-and-UX-Strategy-Memo.docx
+++ b/materi-task-docx/Day10-Task-Habmann-Digital-Learning-TrackLearn-UX-Analysis-and-UX-Strategy-Memo.docx
@@ -2311,9 +2311,9 @@
               </w:tblCellMar>
             </w:tblPr>
             <w:tblGrid>
-              <w:gridCol w:w="977"/>
-              <w:gridCol w:w="5428"/>
-              <w:gridCol w:w="2873"/>
+              <w:gridCol w:w="979"/>
+              <w:gridCol w:w="5400"/>
+              <w:gridCol w:w="2899"/>
             </w:tblGrid>
             <w:tr>
               <w:trPr>
@@ -2322,7 +2322,7 @@
               </w:trPr>
               <w:tc>
                 <w:tcPr>
-                  <w:tcW w:type="dxa" w:w="977"/>
+                  <w:tcW w:type="dxa" w:w="979"/>
                   <w:shd w:val="clear" w:color="auto" w:fill="E6ECF4"/>
                 </w:tcPr>
                 <w:p>
@@ -2340,7 +2340,7 @@
               </w:tc>
               <w:tc>
                 <w:tcPr>
-                  <w:tcW w:type="dxa" w:w="5428"/>
+                  <w:tcW w:type="dxa" w:w="5400"/>
                   <w:shd w:val="clear" w:color="auto" w:fill="E6ECF4"/>
                 </w:tcPr>
                 <w:p>
@@ -2358,7 +2358,7 @@
               </w:tc>
               <w:tc>
                 <w:tcPr>
-                  <w:tcW w:type="dxa" w:w="2873"/>
+                  <w:tcW w:type="dxa" w:w="2899"/>
                   <w:shd w:val="clear" w:color="auto" w:fill="E6ECF4"/>
                 </w:tcPr>
                 <w:p>
@@ -2381,7 +2381,7 @@
               </w:trPr>
               <w:tc>
                 <w:tcPr>
-                  <w:tcW w:type="dxa" w:w="977"/>
+                  <w:tcW w:type="dxa" w:w="979"/>
                 </w:tcPr>
                 <w:p>
                   <w:pPr>
@@ -2397,7 +2397,7 @@
               </w:tc>
               <w:tc>
                 <w:tcPr>
-                  <w:tcW w:type="dxa" w:w="5428"/>
+                  <w:tcW w:type="dxa" w:w="5400"/>
                 </w:tcPr>
                 <w:p>
                   <w:pPr>
@@ -2413,7 +2413,7 @@
               </w:tc>
               <w:tc>
                 <w:tcPr>
-                  <w:tcW w:type="dxa" w:w="2873"/>
+                  <w:tcW w:type="dxa" w:w="2899"/>
                 </w:tcPr>
                 <w:p>
                   <w:pPr>
@@ -2434,7 +2434,7 @@
               </w:trPr>
               <w:tc>
                 <w:tcPr>
-                  <w:tcW w:type="dxa" w:w="977"/>
+                  <w:tcW w:type="dxa" w:w="979"/>
                 </w:tcPr>
                 <w:p>
                   <w:pPr>
@@ -2450,7 +2450,7 @@
               </w:tc>
               <w:tc>
                 <w:tcPr>
-                  <w:tcW w:type="dxa" w:w="5428"/>
+                  <w:tcW w:type="dxa" w:w="5400"/>
                 </w:tcPr>
                 <w:p>
                   <w:pPr>
@@ -2466,7 +2466,7 @@
               </w:tc>
               <w:tc>
                 <w:tcPr>
-                  <w:tcW w:type="dxa" w:w="2873"/>
+                  <w:tcW w:type="dxa" w:w="2899"/>
                 </w:tcPr>
                 <w:p>
                   <w:pPr>
@@ -2487,7 +2487,7 @@
               </w:trPr>
               <w:tc>
                 <w:tcPr>
-                  <w:tcW w:type="dxa" w:w="977"/>
+                  <w:tcW w:type="dxa" w:w="979"/>
                 </w:tcPr>
                 <w:p>
                   <w:pPr>
@@ -2503,7 +2503,7 @@
               </w:tc>
               <w:tc>
                 <w:tcPr>
-                  <w:tcW w:type="dxa" w:w="5428"/>
+                  <w:tcW w:type="dxa" w:w="5400"/>
                 </w:tcPr>
                 <w:p>
                   <w:pPr>
@@ -2519,7 +2519,7 @@
               </w:tc>
               <w:tc>
                 <w:tcPr>
-                  <w:tcW w:type="dxa" w:w="2873"/>
+                  <w:tcW w:type="dxa" w:w="2899"/>
                 </w:tcPr>
                 <w:p>
                   <w:pPr>
@@ -2540,7 +2540,7 @@
               </w:trPr>
               <w:tc>
                 <w:tcPr>
-                  <w:tcW w:type="dxa" w:w="977"/>
+                  <w:tcW w:type="dxa" w:w="979"/>
                 </w:tcPr>
                 <w:p>
                   <w:pPr>
@@ -2556,7 +2556,7 @@
               </w:tc>
               <w:tc>
                 <w:tcPr>
-                  <w:tcW w:type="dxa" w:w="5428"/>
+                  <w:tcW w:type="dxa" w:w="5400"/>
                 </w:tcPr>
                 <w:p>
                   <w:pPr>
@@ -2572,7 +2572,7 @@
               </w:tc>
               <w:tc>
                 <w:tcPr>
-                  <w:tcW w:type="dxa" w:w="2873"/>
+                  <w:tcW w:type="dxa" w:w="2899"/>
                 </w:tcPr>
                 <w:p>
                   <w:pPr>
@@ -2593,7 +2593,7 @@
               </w:trPr>
               <w:tc>
                 <w:tcPr>
-                  <w:tcW w:type="dxa" w:w="977"/>
+                  <w:tcW w:type="dxa" w:w="979"/>
                 </w:tcPr>
                 <w:p>
                   <w:pPr>
@@ -2609,7 +2609,7 @@
               </w:tc>
               <w:tc>
                 <w:tcPr>
-                  <w:tcW w:type="dxa" w:w="5428"/>
+                  <w:tcW w:type="dxa" w:w="5400"/>
                 </w:tcPr>
                 <w:p>
                   <w:pPr>
@@ -2625,7 +2625,7 @@
               </w:tc>
               <w:tc>
                 <w:tcPr>
-                  <w:tcW w:type="dxa" w:w="2873"/>
+                  <w:tcW w:type="dxa" w:w="2899"/>
                 </w:tcPr>
                 <w:p>
                   <w:pPr>
@@ -2646,7 +2646,7 @@
               </w:trPr>
               <w:tc>
                 <w:tcPr>
-                  <w:tcW w:type="dxa" w:w="977"/>
+                  <w:tcW w:type="dxa" w:w="979"/>
                 </w:tcPr>
                 <w:p>
                   <w:pPr>
@@ -2662,7 +2662,7 @@
               </w:tc>
               <w:tc>
                 <w:tcPr>
-                  <w:tcW w:type="dxa" w:w="5428"/>
+                  <w:tcW w:type="dxa" w:w="5400"/>
                 </w:tcPr>
                 <w:p>
                   <w:pPr>
@@ -2672,13 +2672,13 @@
                     <w:rPr>
                       <w:sz w:val="20"/>
                     </w:rPr>
-                    <w:t>Level 3 transfer project: transfer project, items 1 to 4 · a concept for feedback systems, a strategy for progress tracking, a responsive design concept, accessibility integration. transfer project, item 5 and the additional requirement · prioritised measures and a risk analysis, a decision under uncertainty.</w:t>
+                    <w:t>Level 3 transfer project: items 1 to 4 · a concept for feedback systems, a strategy for progress tracking, a responsive design concept, accessibility integration. Also: item 5 and the additional requirement · prioritised measures and a risk analysis, a decision under uncertainty.</w:t>
                   </w:r>
                 </w:p>
               </w:tc>
               <w:tc>
                 <w:tcPr>
-                  <w:tcW w:type="dxa" w:w="2873"/>
+                  <w:tcW w:type="dxa" w:w="2899"/>
                 </w:tcPr>
                 <w:p>
                   <w:pPr>

</xml_diff>